<commit_message>
Capture user thesis (Q-06/D-018): fill ORCL_User_Thesis_and_Questions.docx
Thesis gathered via clarifying questions: interest driven by OCI growth, the
multi-cloud database moat, and a valuation/mean-reversion view; 6-18 month
holding period; long calls, max downside = full premium; year-end target is
multiple expansion to $150 within 2-3 quarters if not by EOY 2026;
invalidation triggers are leverage stress, an AI capex bust, and margin
compression. Earnings dates align to Q-07's canonical FY27 schedule. Gate 8
is no longer blocked on the thesis doc.
</commit_message>
<xml_diff>
--- a/01_Research_Outputs/ORCL_User_Thesis_and_Questions.docx
+++ b/01_Research_Outputs/ORCL_User_Thesis_and_Questions.docx
@@ -39,6 +39,28 @@
         <w:spacing w:after="200"/>
       </w:pPr>
       <w:r>
+        <w:t xml:space="preserve">Optimistic on several tailwinds converging: OCI/cloud infrastructure growth (RPO backlog conversion, AI-training/inference workload capture), the multi-cloud database moat (Autonomous Database, Fusion/NetSuite applications stickiness), and a valuation/mean-reversion setup — I think fair value is significantly above the current price.</w:t>
+      </w:r>
+    </w:p>
+    <w:p>
+      <w:pPr>
+        <w:pBdr>
+          <w:bottom w:val="single" w:color="AAAAAA" w:sz="4"/>
+        </w:pBdr>
+        <w:spacing w:after="200"/>
+      </w:pPr>
+      <w:r>
+        <w:t xml:space="preserve">The market is under-crediting the durability of the OCI buildout and database licensing base relative to the capex/leverage concerns currently pressuring the stock.</w:t>
+      </w:r>
+    </w:p>
+    <w:p>
+      <w:pPr>
+        <w:pBdr>
+          <w:bottom w:val="single" w:color="AAAAAA" w:sz="4"/>
+        </w:pBdr>
+        <w:spacing w:after="200"/>
+      </w:pPr>
+      <w:r>
         <w:t xml:space="preserve"> </w:t>
       </w:r>
     </w:p>
@@ -55,6 +77,63 @@
     </w:p>
     <w:p>
       <w:pPr>
+        <w:pStyle w:val="Heading1"/>
+      </w:pPr>
+      <w:r>
+        <w:t xml:space="preserve">Expected holding period</w:t>
+      </w:r>
+    </w:p>
+    <w:p>
+      <w:pPr>
+        <w:pBdr>
+          <w:bottom w:val="single" w:color="AAAAAA" w:sz="4"/>
+        </w:pBdr>
+        <w:spacing w:after="200"/>
+      </w:pPr>
+      <w:r>
+        <w:t xml:space="preserve">Medium-term: 6–18 months.</w:t>
+      </w:r>
+    </w:p>
+    <w:p>
+      <w:pPr>
+        <w:pStyle w:val="Heading1"/>
+      </w:pPr>
+      <w:r>
+        <w:t xml:space="preserve">Initial year-end price narrative</w:t>
+      </w:r>
+    </w:p>
+    <w:p>
+      <w:pPr>
+        <w:spacing w:after="120"/>
+      </w:pPr>
+      <w:r>
+        <w:t xml:space="preserve">What price and why — the story, not just the number.</w:t>
+      </w:r>
+    </w:p>
+    <w:p>
+      <w:pPr>
+        <w:pBdr>
+          <w:bottom w:val="single" w:color="AAAAAA" w:sz="4"/>
+        </w:pBdr>
+        <w:spacing w:after="200"/>
+      </w:pPr>
+      <w:r>
+        <w:t xml:space="preserve">Target: $150, reached within 2–3 quarters if not by year-end 2026.</w:t>
+      </w:r>
+    </w:p>
+    <w:p>
+      <w:pPr>
+        <w:pBdr>
+          <w:bottom w:val="single" w:color="AAAAAA" w:sz="4"/>
+        </w:pBdr>
+        <w:spacing w:after="200"/>
+      </w:pPr>
+      <w:r>
+        <w:t xml:space="preserve">Thesis is multiple expansion, not primarily EPS growth: the market re-rates Oracle closer to hyperscaler/AI-infrastructure peer multiples as OCI and RPO conversion continue to prove out, easing the current leverage/capex-driven discount.</w:t>
+      </w:r>
+    </w:p>
+    <w:p>
+      <w:pPr>
         <w:pBdr>
           <w:bottom w:val="single" w:color="AAAAAA" w:sz="4"/>
         </w:pBdr>
@@ -80,7 +159,40 @@
         <w:pStyle w:val="Heading1"/>
       </w:pPr>
       <w:r>
-        <w:t xml:space="preserve">Expected holding period</w:t>
+        <w:t xml:space="preserve">What would invalidate your thesis?</w:t>
+      </w:r>
+    </w:p>
+    <w:p>
+      <w:pPr>
+        <w:pBdr>
+          <w:bottom w:val="single" w:color="AAAAAA" w:sz="4"/>
+        </w:pBdr>
+        <w:spacing w:after="200"/>
+      </w:pPr>
+      <w:r>
+        <w:t xml:space="preserve">Balance-sheet/leverage stress: debt load or capex financing needs force dilutive equity issuance or a credit downgrade.</w:t>
+      </w:r>
+    </w:p>
+    <w:p>
+      <w:pPr>
+        <w:pBdr>
+          <w:bottom w:val="single" w:color="AAAAAA" w:sz="4"/>
+        </w:pBdr>
+        <w:spacing w:after="200"/>
+      </w:pPr>
+      <w:r>
+        <w:t xml:space="preserve">AI capex bust: the broader AI infrastructure spending cycle cools, hitting Oracle's largest OCI/cloud deals.</w:t>
+      </w:r>
+    </w:p>
+    <w:p>
+      <w:pPr>
+        <w:pBdr>
+          <w:bottom w:val="single" w:color="AAAAAA" w:sz="4"/>
+        </w:pBdr>
+        <w:spacing w:after="200"/>
+      </w:pPr>
+      <w:r>
+        <w:t xml:space="preserve">Margin compression: depreciation/opex from the capex buildout outpaces revenue growth and crushes GAAP margins.</w:t>
       </w:r>
     </w:p>
     <w:p>
@@ -99,7 +211,7 @@
         <w:pStyle w:val="Heading1"/>
       </w:pPr>
       <w:r>
-        <w:t xml:space="preserve">Initial year-end price narrative</w:t>
+        <w:t xml:space="preserve">Instrument</w:t>
       </w:r>
     </w:p>
     <w:p>
@@ -107,51 +219,18 @@
         <w:spacing w:after="120"/>
       </w:pPr>
       <w:r>
-        <w:t xml:space="preserve">What price and why — the story, not just the number.</w:t>
-      </w:r>
-    </w:p>
-    <w:p>
-      <w:pPr>
-        <w:pBdr>
-          <w:bottom w:val="single" w:color="AAAAAA" w:sz="4"/>
-        </w:pBdr>
-        <w:spacing w:after="200"/>
-      </w:pPr>
-      <w:r>
-        <w:t xml:space="preserve"> </w:t>
-      </w:r>
-    </w:p>
-    <w:p>
-      <w:pPr>
-        <w:pBdr>
-          <w:bottom w:val="single" w:color="AAAAAA" w:sz="4"/>
-        </w:pBdr>
-        <w:spacing w:after="200"/>
-      </w:pPr>
-      <w:r>
-        <w:t xml:space="preserve"> </w:t>
-      </w:r>
-    </w:p>
-    <w:p>
-      <w:pPr>
-        <w:pBdr>
-          <w:bottom w:val="single" w:color="AAAAAA" w:sz="4"/>
-        </w:pBdr>
-        <w:spacing w:after="200"/>
-      </w:pPr>
-      <w:r>
-        <w:t xml:space="preserve"> </w:t>
-      </w:r>
-    </w:p>
-    <w:p>
-      <w:pPr>
-        <w:pBdr>
-          <w:bottom w:val="single" w:color="AAAAAA" w:sz="4"/>
-        </w:pBdr>
-        <w:spacing w:after="200"/>
-      </w:pPr>
-      <w:r>
-        <w:t xml:space="preserve"> </w:t>
+        <w:t xml:space="preserve">Is this model for stock ownership, calls, or a call spread?</w:t>
+      </w:r>
+    </w:p>
+    <w:p>
+      <w:pPr>
+        <w:pBdr>
+          <w:bottom w:val="single" w:color="AAAAAA" w:sz="4"/>
+        </w:pBdr>
+        <w:spacing w:after="200"/>
+      </w:pPr>
+      <w:r>
+        <w:t xml:space="preserve">Long calls.</w:t>
       </w:r>
     </w:p>
     <w:p>
@@ -159,51 +238,26 @@
         <w:pStyle w:val="Heading1"/>
       </w:pPr>
       <w:r>
-        <w:t xml:space="preserve">What would invalidate your thesis?</w:t>
-      </w:r>
-    </w:p>
-    <w:p>
-      <w:pPr>
-        <w:pBdr>
-          <w:bottom w:val="single" w:color="AAAAAA" w:sz="4"/>
-        </w:pBdr>
-        <w:spacing w:after="200"/>
-      </w:pPr>
-      <w:r>
-        <w:t xml:space="preserve"> </w:t>
-      </w:r>
-    </w:p>
-    <w:p>
-      <w:pPr>
-        <w:pBdr>
-          <w:bottom w:val="single" w:color="AAAAAA" w:sz="4"/>
-        </w:pBdr>
-        <w:spacing w:after="200"/>
-      </w:pPr>
-      <w:r>
-        <w:t xml:space="preserve"> </w:t>
-      </w:r>
-    </w:p>
-    <w:p>
-      <w:pPr>
-        <w:pBdr>
-          <w:bottom w:val="single" w:color="AAAAAA" w:sz="4"/>
-        </w:pBdr>
-        <w:spacing w:after="200"/>
-      </w:pPr>
-      <w:r>
-        <w:t xml:space="preserve"> </w:t>
-      </w:r>
-    </w:p>
-    <w:p>
-      <w:pPr>
-        <w:pBdr>
-          <w:bottom w:val="single" w:color="AAAAAA" w:sz="4"/>
-        </w:pBdr>
-        <w:spacing w:after="200"/>
-      </w:pPr>
-      <w:r>
-        <w:t xml:space="preserve"> </w:t>
+        <w:t xml:space="preserve">Maximum acceptable downside</w:t>
+      </w:r>
+    </w:p>
+    <w:p>
+      <w:pPr>
+        <w:spacing w:after="120"/>
+      </w:pPr>
+      <w:r>
+        <w:t xml:space="preserve">Dollar amount or % of position.</w:t>
+      </w:r>
+    </w:p>
+    <w:p>
+      <w:pPr>
+        <w:pBdr>
+          <w:bottom w:val="single" w:color="AAAAAA" w:sz="4"/>
+        </w:pBdr>
+        <w:spacing w:after="200"/>
+      </w:pPr>
+      <w:r>
+        <w:t xml:space="preserve">Full premium — willing to lose 100% of the options premium paid; standard risk profile for a directional long-calls bet.</w:t>
       </w:r>
     </w:p>
     <w:p>
@@ -211,7 +265,7 @@
         <w:pStyle w:val="Heading1"/>
       </w:pPr>
       <w:r>
-        <w:t xml:space="preserve">Instrument</w:t>
+        <w:t xml:space="preserve">Earnings dates you want price targets for</w:t>
       </w:r>
     </w:p>
     <w:p>
@@ -219,60 +273,6 @@
         <w:spacing w:after="120"/>
       </w:pPr>
       <w:r>
-        <w:t xml:space="preserve">Is this model for stock ownership, calls, or a call spread?</w:t>
-      </w:r>
-    </w:p>
-    <w:p>
-      <w:pPr>
-        <w:pBdr>
-          <w:bottom w:val="single" w:color="AAAAAA" w:sz="4"/>
-        </w:pBdr>
-        <w:spacing w:after="200"/>
-      </w:pPr>
-      <w:r>
-        <w:t xml:space="preserve"> </w:t>
-      </w:r>
-    </w:p>
-    <w:p>
-      <w:pPr>
-        <w:pStyle w:val="Heading1"/>
-      </w:pPr>
-      <w:r>
-        <w:t xml:space="preserve">Maximum acceptable downside</w:t>
-      </w:r>
-    </w:p>
-    <w:p>
-      <w:pPr>
-        <w:spacing w:after="120"/>
-      </w:pPr>
-      <w:r>
-        <w:t xml:space="preserve">Dollar amount or % of position.</w:t>
-      </w:r>
-    </w:p>
-    <w:p>
-      <w:pPr>
-        <w:pBdr>
-          <w:bottom w:val="single" w:color="AAAAAA" w:sz="4"/>
-        </w:pBdr>
-        <w:spacing w:after="200"/>
-      </w:pPr>
-      <w:r>
-        <w:t xml:space="preserve"> </w:t>
-      </w:r>
-    </w:p>
-    <w:p>
-      <w:pPr>
-        <w:pStyle w:val="Heading1"/>
-      </w:pPr>
-      <w:r>
-        <w:t xml:space="preserve">Earnings dates you want price targets for</w:t>
-      </w:r>
-    </w:p>
-    <w:p>
-      <w:pPr>
-        <w:spacing w:after="120"/>
-      </w:pPr>
-      <w:r>
         <w:t xml:space="preserve">List the four dates.</w:t>
       </w:r>
     </w:p>
@@ -284,40 +284,40 @@
         <w:spacing w:after="200"/>
       </w:pPr>
       <w:r>
-        <w:t xml:space="preserve"> </w:t>
-      </w:r>
-    </w:p>
-    <w:p>
-      <w:pPr>
-        <w:pBdr>
-          <w:bottom w:val="single" w:color="AAAAAA" w:sz="4"/>
-        </w:pBdr>
-        <w:spacing w:after="200"/>
-      </w:pPr>
-      <w:r>
-        <w:t xml:space="preserve"> </w:t>
-      </w:r>
-    </w:p>
-    <w:p>
-      <w:pPr>
-        <w:pBdr>
-          <w:bottom w:val="single" w:color="AAAAAA" w:sz="4"/>
-        </w:pBdr>
-        <w:spacing w:after="200"/>
-      </w:pPr>
-      <w:r>
-        <w:t xml:space="preserve"> </w:t>
-      </w:r>
-    </w:p>
-    <w:p>
-      <w:pPr>
-        <w:pBdr>
-          <w:bottom w:val="single" w:color="AAAAAA" w:sz="4"/>
-        </w:pBdr>
-        <w:spacing w:after="200"/>
-      </w:pPr>
-      <w:r>
-        <w:t xml:space="preserve"> </w:t>
+        <w:t xml:space="preserve">FY27 Q1 (quarter ended Aug 31, 2026): 2026-09-10 — management-scheduled (per project_scope.md / Q-07).</w:t>
+      </w:r>
+    </w:p>
+    <w:p>
+      <w:pPr>
+        <w:pBdr>
+          <w:bottom w:val="single" w:color="AAAAAA" w:sz="4"/>
+        </w:pBdr>
+        <w:spacing w:after="200"/>
+      </w:pPr>
+      <w:r>
+        <w:t xml:space="preserve">FY27 Q2 (quarter ended Nov 30, 2026): est. 2026-12-10 — estimate only (Q-07), based on Oracle's historical mid-December Q2 release pattern.</w:t>
+      </w:r>
+    </w:p>
+    <w:p>
+      <w:pPr>
+        <w:pBdr>
+          <w:bottom w:val="single" w:color="AAAAAA" w:sz="4"/>
+        </w:pBdr>
+        <w:spacing w:after="200"/>
+      </w:pPr>
+      <w:r>
+        <w:t xml:space="preserve">FY27 Q3 (quarter ended Feb 28, 2027): est. 2027-03-10 — estimate only (Q-07), based on Oracle's historical mid-March Q3 release pattern.</w:t>
+      </w:r>
+    </w:p>
+    <w:p>
+      <w:pPr>
+        <w:pBdr>
+          <w:bottom w:val="single" w:color="AAAAAA" w:sz="4"/>
+        </w:pBdr>
+        <w:spacing w:after="200"/>
+      </w:pPr>
+      <w:r>
+        <w:t xml:space="preserve">FY27 Q4 / FY27 annual (quarter ended May 31, 2027): est. 2027-06-10 — estimate only (Q-07), based on Oracle's historical mid-June Q4 release pattern.</w:t>
       </w:r>
     </w:p>
     <w:sectPr>

</xml_diff>